<commit_message>
ADDING TODAY'S WORK - 02.07.2026
</commit_message>
<xml_diff>
--- a/write_up/drafts/4_results/results_DRAFT_1.docx
+++ b/write_up/drafts/4_results/results_DRAFT_1.docx
@@ -36,7 +36,7 @@
         <w:t>Quality control metrics indicated consistent grouping between</w:t>
       </w:r>
       <w:r>
-        <w:t xml:space="preserve"> samples (including </w:t>
+        <w:t xml:space="preserve"> samples (</w:t>
       </w:r>
       <w:r>
         <w:t>control and treatment conditions</w:t>
@@ -60,10 +60,7 @@
         <w:t xml:space="preserve">primary HBECs exposed to </w:t>
       </w:r>
       <w:r>
-        <w:t xml:space="preserve">protease </w:t>
-      </w:r>
-      <w:r>
-        <w:t>(24</w:t>
+        <w:t>protease (24</w:t>
       </w:r>
       <w:r>
         <w:sym w:font="Symbol" w:char="F06D"/>
@@ -78,66 +75,146 @@
         <w:t xml:space="preserve"> </w:t>
       </w:r>
       <w:r>
-        <w:t>These samples exhibited a slight decrease in</w:t>
-      </w:r>
-      <w:r>
-        <w:t xml:space="preserve"> read</w:t>
-      </w:r>
-      <w:r>
-        <w:t xml:space="preserve"> base quality score (Phred) at 21bp decreasing to 38.01, 37.27, </w:t>
-      </w:r>
-      <w:r>
-        <w:t>36.77 (replicate 1-3) while all other samples remained &gt;39 (Figure S1[sequence quality histogram]).</w:t>
-      </w:r>
-      <w:r>
-        <w:t xml:space="preserve"> A unique base composition </w:t>
+        <w:t xml:space="preserve">These samples exhibited a </w:t>
+      </w:r>
+      <w:r>
+        <w:t xml:space="preserve">slightly different profile across multiple metrics. </w:t>
+      </w:r>
+      <w:r>
+        <w:t xml:space="preserve">A unique base composition </w:t>
       </w:r>
       <w:r>
         <w:t>was</w:t>
       </w:r>
       <w:r>
-        <w:t xml:space="preserve"> shared by dose </w:t>
-      </w:r>
-      <w:r>
-        <w:t>24</w:t>
+        <w:t xml:space="preserve"> shared by dose 24</w:t>
       </w:r>
       <w:r>
         <w:sym w:font="Symbol" w:char="F06D"/>
       </w:r>
       <w:r>
+        <w:t xml:space="preserve">g samples </w:t>
+      </w:r>
+      <w:r>
+        <w:t>and GC content</w:t>
+      </w:r>
+      <w:r>
+        <w:t xml:space="preserve"> was higher</w:t>
+      </w:r>
+      <w:r>
+        <w:t>, with reads most frequently possessing 57%, 61% and 80% GC content</w:t>
+      </w:r>
+      <w:r>
+        <w:t>,</w:t>
+      </w:r>
+      <w:r>
+        <w:t xml:space="preserve"> whereas peak </w:t>
+      </w:r>
+      <w:r>
+        <w:t xml:space="preserve">GC </w:t>
+      </w:r>
+      <w:r>
+        <w:t xml:space="preserve">content in all other samples was 49% </w:t>
+      </w:r>
+      <w:r>
+        <w:t>(Figure S1[</w:t>
+      </w:r>
+      <w:r>
+        <w:t>Per Base Sequence Content</w:t>
+      </w:r>
+      <w:r>
+        <w:t xml:space="preserve"> and per sequence </w:t>
+      </w:r>
+      <w:r>
+        <w:t>GC</w:t>
+      </w:r>
+      <w:r>
+        <w:t xml:space="preserve"> content</w:t>
+      </w:r>
+      <w:r>
+        <w:t>]).</w:t>
+      </w:r>
+      <w:r>
+        <w:t xml:space="preserve"> Overall GC content </w:t>
+      </w:r>
+      <w:r>
+        <w:t xml:space="preserve">across all reads </w:t>
+      </w:r>
+      <w:r>
+        <w:t>was ~63% for dose 24</w:t>
+      </w:r>
+      <w:r>
+        <w:sym w:font="Symbol" w:char="F06D"/>
+      </w:r>
+      <w:r>
+        <w:t>g samples compared to ~51% for all other samples.</w:t>
+      </w:r>
+    </w:p>
+    <w:p>
+      <w:r>
+        <w:t>Sequence length distributions</w:t>
+      </w:r>
+      <w:r>
+        <w:t xml:space="preserve"> showed a </w:t>
+      </w:r>
+      <w:r>
+        <w:t>97.9</w:t>
+      </w:r>
+      <w:r>
+        <w:t xml:space="preserve">% </w:t>
+      </w:r>
+      <w:r>
+        <w:t>greater mean count of</w:t>
+      </w:r>
+      <w:r>
+        <w:t xml:space="preserve"> </w:t>
+      </w:r>
+      <w:r>
+        <w:t xml:space="preserve">18bp reads </w:t>
+      </w:r>
+      <w:r>
+        <w:t xml:space="preserve">in </w:t>
+      </w:r>
+      <w:r>
+        <w:t>dose 24</w:t>
+      </w:r>
+      <w:r>
+        <w:sym w:font="Symbol" w:char="F06D"/>
+      </w:r>
+      <w:r>
         <w:t>g</w:t>
       </w:r>
       <w:r>
-        <w:t xml:space="preserve"> samples </w:t>
-      </w:r>
-      <w:r>
-        <w:t>and GC content</w:t>
-      </w:r>
-      <w:r>
-        <w:t xml:space="preserve"> was higher, with additional</w:t>
-      </w:r>
-      <w:r>
-        <w:t xml:space="preserve"> peaks around 61% and 80%</w:t>
-      </w:r>
-      <w:r>
         <w:t xml:space="preserve"> </w:t>
       </w:r>
       <w:r>
-        <w:t>(Figure S1[</w:t>
-      </w:r>
-      <w:r>
-        <w:t>Per Base Sequence Content</w:t>
-      </w:r>
-      <w:r>
-        <w:t xml:space="preserve"> and per sequence </w:t>
+        <w:t xml:space="preserve">samples </w:t>
+      </w:r>
+      <w:r>
+        <w:t xml:space="preserve">compared to </w:t>
+      </w:r>
+      <w:r>
+        <w:t xml:space="preserve">the average of </w:t>
+      </w:r>
+      <w:r>
+        <w:t xml:space="preserve">all other samples </w:t>
+      </w:r>
+      <w:r>
+        <w:t>(</w:t>
+      </w:r>
+      <w:r>
+        <w:t>Figure</w:t>
+      </w:r>
+      <w:r>
+        <w:t xml:space="preserve"> S1[</w:t>
       </w:r>
       <w:proofErr w:type="spellStart"/>
       <w:r>
-        <w:t>gc</w:t>
+        <w:t>miRTrace</w:t>
       </w:r>
       <w:proofErr w:type="spellEnd"/>
       <w:r>
-        <w:t xml:space="preserve"> content</w:t>
+        <w:t xml:space="preserve"> read length distribution</w:t>
       </w:r>
       <w:r>
         <w:t>])</w:t>
@@ -146,7 +223,7 @@
         <w:t>.</w:t>
       </w:r>
       <w:r>
-        <w:t xml:space="preserve"> Overall GC content was ~63% for </w:t>
+        <w:t xml:space="preserve"> Large read duplication was observed in </w:t>
       </w:r>
       <w:r>
         <w:t>dose 24</w:t>
@@ -158,13 +235,83 @@
         <w:t>g samples</w:t>
       </w:r>
       <w:r>
-        <w:t xml:space="preserve"> compared to ~51% for all other samples.</w:t>
+        <w:t xml:space="preserve">, </w:t>
+      </w:r>
+      <w:r>
+        <w:t>with 42</w:t>
+      </w:r>
+      <w:r>
+        <w:t>% library duplication</w:t>
+      </w:r>
+      <w:r>
+        <w:t xml:space="preserve"> (mean average)</w:t>
+      </w:r>
+      <w:r>
+        <w:t xml:space="preserve"> compared to </w:t>
+      </w:r>
+      <w:r>
+        <w:t>5</w:t>
+      </w:r>
+      <w:r>
+        <w:t>% across all other samples</w:t>
+      </w:r>
+      <w:r>
+        <w:t xml:space="preserve"> (Fig S1[sequence duplication levels]).</w:t>
+      </w:r>
+      <w:r>
+        <w:t xml:space="preserve"> </w:t>
+      </w:r>
+      <w:r>
+        <w:t>Mean average l</w:t>
+      </w:r>
+      <w:r>
+        <w:t xml:space="preserve">evels of </w:t>
+      </w:r>
+      <w:r>
+        <w:t xml:space="preserve">miRNA, </w:t>
+      </w:r>
+      <w:r>
+        <w:t xml:space="preserve">ribosomal RNA (rRNA) and transfer RNA (tRNA) were higher in all </w:t>
+      </w:r>
+      <w:r>
+        <w:t>dos</w:t>
+      </w:r>
+      <w:r>
+        <w:t>e</w:t>
+      </w:r>
+      <w:r>
+        <w:t xml:space="preserve"> 24</w:t>
+      </w:r>
+      <w:r>
+        <w:sym w:font="Symbol" w:char="F06D"/>
+      </w:r>
+      <w:r>
+        <w:t>g samples</w:t>
+      </w:r>
+      <w:r>
+        <w:t xml:space="preserve"> </w:t>
+      </w:r>
+      <w:r>
+        <w:t>with</w:t>
+      </w:r>
+      <w:r>
+        <w:t xml:space="preserve"> rRNA observing the largest increase, from 8.52% to 53.4% </w:t>
+      </w:r>
+      <w:r>
+        <w:t>(Fig1 [RNA categories])</w:t>
+      </w:r>
+      <w:r>
+        <w:t>.</w:t>
       </w:r>
     </w:p>
-    <w:p/>
     <w:p>
       <w:r>
-        <w:t xml:space="preserve">Quality control data indicated high confidence in sequencing output for both primary HBECs and Calu-3 cells, with a mean [quality] for all samples tested of [&gt;38] (Phred). </w:t>
+        <w:t xml:space="preserve"> </w:t>
+      </w:r>
+    </w:p>
+    <w:p>
+      <w:r>
+        <w:t xml:space="preserve">A decrease in read base quality score (Phred) was observed at 21bp, decreasing to 38.01, 37.27, 36.77 (replicate 1-3) while all other samples remained &gt;39 (Figure S1[sequence quality histogram]). </w:t>
       </w:r>
     </w:p>
     <w:p/>
@@ -197,7 +344,79 @@
       </w:r>
     </w:p>
     <w:p>
-      <w:r>
+      <w:pPr>
+        <w:pStyle w:val="ListParagraph"/>
+        <w:numPr>
+          <w:ilvl w:val="0"/>
+          <w:numId w:val="13"/>
+        </w:numPr>
+      </w:pPr>
+      <w:r>
+        <w:t>Effect of untreated vs treated</w:t>
+      </w:r>
+    </w:p>
+    <w:p>
+      <w:pPr>
+        <w:pStyle w:val="ListParagraph"/>
+        <w:numPr>
+          <w:ilvl w:val="1"/>
+          <w:numId w:val="13"/>
+        </w:numPr>
+      </w:pPr>
+    </w:p>
+    <w:p>
+      <w:pPr>
+        <w:pStyle w:val="ListParagraph"/>
+        <w:numPr>
+          <w:ilvl w:val="0"/>
+          <w:numId w:val="13"/>
+        </w:numPr>
+      </w:pPr>
+      <w:r>
+        <w:t xml:space="preserve">Comparison of primary vs </w:t>
+      </w:r>
+      <w:proofErr w:type="spellStart"/>
+      <w:r>
+        <w:t>hbec</w:t>
+      </w:r>
+      <w:proofErr w:type="spellEnd"/>
+    </w:p>
+    <w:p>
+      <w:pPr>
+        <w:pStyle w:val="ListParagraph"/>
+        <w:numPr>
+          <w:ilvl w:val="1"/>
+          <w:numId w:val="13"/>
+        </w:numPr>
+      </w:pPr>
+      <w:r>
+        <w:t>Reductions in</w:t>
+      </w:r>
+      <w:r>
+        <w:t xml:space="preserve"> miRNA,</w:t>
+      </w:r>
+      <w:r>
+        <w:t xml:space="preserve"> rRNA and tRNA were observed</w:t>
+      </w:r>
+      <w:r>
+        <w:t>.</w:t>
+      </w:r>
+    </w:p>
+    <w:p>
+      <w:pPr>
+        <w:pStyle w:val="ListParagraph"/>
+        <w:numPr>
+          <w:ilvl w:val="1"/>
+          <w:numId w:val="13"/>
+        </w:numPr>
+      </w:pPr>
+      <w:r>
+        <w:t>[state this was not condition dependent for calu-3 cells as per the boxplot]</w:t>
+      </w:r>
+    </w:p>
+    <w:p>
+      <w:r>
+        <w:lastRenderedPageBreak/>
         <w:t xml:space="preserve">Analysis of </w:t>
       </w:r>
       <w:r>
@@ -221,25 +440,19 @@
         <w:t xml:space="preserve"> marked increase in mean EV miRNA content</w:t>
       </w:r>
       <w:r>
-        <w:t xml:space="preserve"> following protease exposure</w:t>
+        <w:t xml:space="preserve"> following </w:t>
+      </w:r>
+      <w:r>
+        <w:t>allergen</w:t>
+      </w:r>
+      <w:r>
+        <w:t xml:space="preserve"> exposure</w:t>
       </w:r>
       <w:r>
         <w:t xml:space="preserve"> in primary HBECs</w:t>
       </w:r>
       <w:r>
-        <w:t xml:space="preserve">, increasing from 13,289 miRNAs in untreated samples to </w:t>
-      </w:r>
-      <w:r>
-        <w:t>52</w:t>
-      </w:r>
-      <w:r>
-        <w:t>,</w:t>
-      </w:r>
-      <w:r>
-        <w:t>529</w:t>
-      </w:r>
-      <w:r>
-        <w:t xml:space="preserve"> in treated</w:t>
+        <w:t>, increasing from 13,289 miRNAs in untreated samples to 52,529 in treated</w:t>
       </w:r>
       <w:r>
         <w:t>.</w:t>
@@ -251,39 +464,112 @@
         <w:t xml:space="preserve"> in Calu-3 cells</w:t>
       </w:r>
       <w:r>
-        <w:t xml:space="preserve">, increasing from </w:t>
-      </w:r>
-      <w:r>
-        <w:t>2</w:t>
-      </w:r>
-      <w:r>
-        <w:t>,</w:t>
-      </w:r>
-      <w:r>
-        <w:t>289</w:t>
-      </w:r>
-      <w:r>
-        <w:t xml:space="preserve"> to </w:t>
-      </w:r>
-      <w:r>
-        <w:t>2</w:t>
-      </w:r>
-      <w:r>
-        <w:t>,</w:t>
-      </w:r>
-      <w:r>
-        <w:t>547</w:t>
+        <w:t xml:space="preserve">, increasing from 2,289 to 2,547 </w:t>
+      </w:r>
+      <w:r>
+        <w:t>post-exposure</w:t>
+      </w:r>
+      <w:r>
+        <w:t xml:space="preserve">. </w:t>
+      </w:r>
+      <w:r>
+        <w:t>Observing dose</w:t>
+      </w:r>
+      <w:r>
+        <w:t xml:space="preserve">-related </w:t>
+      </w:r>
+      <w:r>
+        <w:t xml:space="preserve">miRNA counts, </w:t>
+      </w:r>
+      <w:r>
+        <w:t>dose 24</w:t>
+      </w:r>
+      <w:r>
+        <w:sym w:font="Symbol" w:char="F06D"/>
+      </w:r>
+      <w:r>
+        <w:t>g samples</w:t>
+      </w:r>
+      <w:r>
+        <w:t xml:space="preserve"> showed consistently high miRNA </w:t>
+      </w:r>
+      <w:proofErr w:type="gramStart"/>
+      <w:r>
+        <w:t>levels,</w:t>
+      </w:r>
+      <w:proofErr w:type="gramEnd"/>
+      <w:r>
+        <w:t xml:space="preserve"> however the highest count originated from dose 0.005</w:t>
+      </w:r>
+      <w:r>
+        <w:sym w:font="Symbol" w:char="F06D"/>
+      </w:r>
+      <w:r>
+        <w:t>g</w:t>
+      </w:r>
+      <w:r>
+        <w:t xml:space="preserve"> sample 3.</w:t>
+      </w:r>
+    </w:p>
+    <w:p>
+      <w:r>
+        <w:t>[need to show the levels of untreated because this is how we compare de results and if there’s insufficient levels then it undermines the whole analysis]</w:t>
+      </w:r>
+    </w:p>
+    <w:p>
+      <w:r>
+        <w:t>increase in EV miRNA content only appeared…</w:t>
+      </w:r>
+    </w:p>
+    <w:p>
+      <w:r>
+        <w:t xml:space="preserve">Exposure to </w:t>
+      </w:r>
+      <w:r>
+        <w:t>poly I:C</w:t>
+      </w:r>
+      <w:r>
+        <w:t>, a known immunostimulant, in Calu-3 cells did not significantly increase the RNA content.</w:t>
+      </w:r>
+    </w:p>
+    <w:p/>
+    <w:p>
+      <w:r>
+        <w:t xml:space="preserve">We reviewed the QC data to ensure </w:t>
+      </w:r>
+      <w:r>
+        <w:t xml:space="preserve">the </w:t>
+      </w:r>
+      <w:r>
+        <w:t xml:space="preserve">disparity wasn’t due to </w:t>
+      </w:r>
+      <w:r>
+        <w:t xml:space="preserve">differences in </w:t>
+      </w:r>
+      <w:r>
+        <w:t xml:space="preserve">sequencing </w:t>
+      </w:r>
+      <w:r>
+        <w:t>quality</w:t>
+      </w:r>
+      <w:r>
+        <w:t xml:space="preserve">. </w:t>
+      </w:r>
+      <w:r>
+        <w:t>Quality control data indicated high confidence in sequencing output for both primary HBECs and Calu-3 cells, with</w:t>
+      </w:r>
+      <w:r>
+        <w:t xml:space="preserve"> per</w:t>
       </w:r>
       <w:r>
         <w:t xml:space="preserve"> </w:t>
       </w:r>
       <w:r>
-        <w:t>post-exposure</w:t>
-      </w:r>
-      <w:r>
-        <w:t>.</w:t>
+        <w:t>read quality peaking at 40 (Phred) with no low-quality subsets identified. Library size was consistent between cell types with a mean average of 5.95x10^6 reads post-trimming for primary HBECs and 5.73x10^6 for Calu-3 cells.</w:t>
       </w:r>
     </w:p>
+    <w:p/>
+    <w:p/>
     <w:p/>
     <w:p>
       <w:pPr>
@@ -297,6 +583,79 @@
           <w:u w:val="single"/>
         </w:rPr>
         <w:t>Archive</w:t>
+      </w:r>
+    </w:p>
+    <w:p/>
+    <w:p>
+      <w:proofErr w:type="spellStart"/>
+      <w:r>
+        <w:t>Mirtrace</w:t>
+      </w:r>
+      <w:proofErr w:type="spellEnd"/>
+      <w:r>
+        <w:t xml:space="preserve"> </w:t>
+      </w:r>
+      <w:proofErr w:type="spellStart"/>
+      <w:r>
+        <w:t>lengh</w:t>
+      </w:r>
+      <w:proofErr w:type="spellEnd"/>
+      <w:r>
+        <w:t xml:space="preserve"> distribution:</w:t>
+      </w:r>
+    </w:p>
+    <w:p>
+      <w:pPr>
+        <w:pStyle w:val="ListParagraph"/>
+        <w:numPr>
+          <w:ilvl w:val="0"/>
+          <w:numId w:val="11"/>
+        </w:numPr>
+      </w:pPr>
+      <w:r>
+        <w:t>dose 24</w:t>
+      </w:r>
+      <w:r>
+        <w:sym w:font="Symbol" w:char="F06D"/>
+      </w:r>
+      <w:r>
+        <w:t>g samples had a [] greater mean frequency of 18bp reads compared to all other samples [fig].</w:t>
+      </w:r>
+    </w:p>
+    <w:p>
+      <w:pPr>
+        <w:pStyle w:val="ListParagraph"/>
+        <w:numPr>
+          <w:ilvl w:val="0"/>
+          <w:numId w:val="11"/>
+        </w:numPr>
+      </w:pPr>
+      <w:r>
+        <w:t>Sequence length distributions revealed a greater number of 18bp reads for dose 24</w:t>
+      </w:r>
+      <w:r>
+        <w:sym w:font="Symbol" w:char="F06D"/>
+      </w:r>
+      <w:r>
+        <w:t>g samples.</w:t>
+      </w:r>
+    </w:p>
+    <w:p>
+      <w:pPr>
+        <w:pStyle w:val="ListParagraph"/>
+        <w:numPr>
+          <w:ilvl w:val="0"/>
+          <w:numId w:val="11"/>
+        </w:numPr>
+      </w:pPr>
+      <w:r>
+        <w:t>Unique traces of sequence length distribution were observed for dose 24</w:t>
+      </w:r>
+      <w:r>
+        <w:sym w:font="Symbol" w:char="F06D"/>
+      </w:r>
+      <w:r>
+        <w:t xml:space="preserve">g samples, with greater 18bp reads. </w:t>
       </w:r>
     </w:p>
     <w:p/>
@@ -403,6 +762,95 @@
     </w:lvl>
   </w:abstractNum>
   <w:abstractNum w:abstractNumId="1" w15:restartNumberingAfterBreak="0">
+    <w:nsid w:val="01EA0A06"/>
+    <w:multiLevelType w:val="hybridMultilevel"/>
+    <w:tmpl w:val="F3908F8C"/>
+    <w:lvl w:ilvl="0" w:tplc="0809000F">
+      <w:start w:val="1"/>
+      <w:numFmt w:val="decimal"/>
+      <w:lvlText w:val="%1."/>
+      <w:lvlJc w:val="left"/>
+      <w:pPr>
+        <w:ind w:left="720" w:hanging="360"/>
+      </w:pPr>
+      <w:rPr>
+        <w:rFonts w:hint="default"/>
+      </w:rPr>
+    </w:lvl>
+    <w:lvl w:ilvl="1" w:tplc="08090019" w:tentative="1">
+      <w:start w:val="1"/>
+      <w:numFmt w:val="lowerLetter"/>
+      <w:lvlText w:val="%2."/>
+      <w:lvlJc w:val="left"/>
+      <w:pPr>
+        <w:ind w:left="1440" w:hanging="360"/>
+      </w:pPr>
+    </w:lvl>
+    <w:lvl w:ilvl="2" w:tplc="0809001B" w:tentative="1">
+      <w:start w:val="1"/>
+      <w:numFmt w:val="lowerRoman"/>
+      <w:lvlText w:val="%3."/>
+      <w:lvlJc w:val="right"/>
+      <w:pPr>
+        <w:ind w:left="2160" w:hanging="180"/>
+      </w:pPr>
+    </w:lvl>
+    <w:lvl w:ilvl="3" w:tplc="0809000F" w:tentative="1">
+      <w:start w:val="1"/>
+      <w:numFmt w:val="decimal"/>
+      <w:lvlText w:val="%4."/>
+      <w:lvlJc w:val="left"/>
+      <w:pPr>
+        <w:ind w:left="2880" w:hanging="360"/>
+      </w:pPr>
+    </w:lvl>
+    <w:lvl w:ilvl="4" w:tplc="08090019" w:tentative="1">
+      <w:start w:val="1"/>
+      <w:numFmt w:val="lowerLetter"/>
+      <w:lvlText w:val="%5."/>
+      <w:lvlJc w:val="left"/>
+      <w:pPr>
+        <w:ind w:left="3600" w:hanging="360"/>
+      </w:pPr>
+    </w:lvl>
+    <w:lvl w:ilvl="5" w:tplc="0809001B" w:tentative="1">
+      <w:start w:val="1"/>
+      <w:numFmt w:val="lowerRoman"/>
+      <w:lvlText w:val="%6."/>
+      <w:lvlJc w:val="right"/>
+      <w:pPr>
+        <w:ind w:left="4320" w:hanging="180"/>
+      </w:pPr>
+    </w:lvl>
+    <w:lvl w:ilvl="6" w:tplc="0809000F" w:tentative="1">
+      <w:start w:val="1"/>
+      <w:numFmt w:val="decimal"/>
+      <w:lvlText w:val="%7."/>
+      <w:lvlJc w:val="left"/>
+      <w:pPr>
+        <w:ind w:left="5040" w:hanging="360"/>
+      </w:pPr>
+    </w:lvl>
+    <w:lvl w:ilvl="7" w:tplc="08090019" w:tentative="1">
+      <w:start w:val="1"/>
+      <w:numFmt w:val="lowerLetter"/>
+      <w:lvlText w:val="%8."/>
+      <w:lvlJc w:val="left"/>
+      <w:pPr>
+        <w:ind w:left="5760" w:hanging="360"/>
+      </w:pPr>
+    </w:lvl>
+    <w:lvl w:ilvl="8" w:tplc="0809001B" w:tentative="1">
+      <w:start w:val="1"/>
+      <w:numFmt w:val="lowerRoman"/>
+      <w:lvlText w:val="%9."/>
+      <w:lvlJc w:val="right"/>
+      <w:pPr>
+        <w:ind w:left="6480" w:hanging="180"/>
+      </w:pPr>
+    </w:lvl>
+  </w:abstractNum>
+  <w:abstractNum w:abstractNumId="2" w15:restartNumberingAfterBreak="0">
     <w:nsid w:val="0350554E"/>
     <w:multiLevelType w:val="hybridMultilevel"/>
     <w:tmpl w:val="62DE4202"/>
@@ -491,7 +939,7 @@
       </w:pPr>
     </w:lvl>
   </w:abstractNum>
-  <w:abstractNum w:abstractNumId="2" w15:restartNumberingAfterBreak="0">
+  <w:abstractNum w:abstractNumId="3" w15:restartNumberingAfterBreak="0">
     <w:nsid w:val="12976C58"/>
     <w:multiLevelType w:val="hybridMultilevel"/>
     <w:tmpl w:val="622A45AA"/>
@@ -577,7 +1025,7 @@
       </w:pPr>
     </w:lvl>
   </w:abstractNum>
-  <w:abstractNum w:abstractNumId="3" w15:restartNumberingAfterBreak="0">
+  <w:abstractNum w:abstractNumId="4" w15:restartNumberingAfterBreak="0">
     <w:nsid w:val="13B071E9"/>
     <w:multiLevelType w:val="hybridMultilevel"/>
     <w:tmpl w:val="6C628012"/>
@@ -666,7 +1114,7 @@
       </w:pPr>
     </w:lvl>
   </w:abstractNum>
-  <w:abstractNum w:abstractNumId="4" w15:restartNumberingAfterBreak="0">
+  <w:abstractNum w:abstractNumId="5" w15:restartNumberingAfterBreak="0">
     <w:nsid w:val="14C612B6"/>
     <w:multiLevelType w:val="hybridMultilevel"/>
     <w:tmpl w:val="00A29352"/>
@@ -779,7 +1227,120 @@
       </w:rPr>
     </w:lvl>
   </w:abstractNum>
-  <w:abstractNum w:abstractNumId="5" w15:restartNumberingAfterBreak="0">
+  <w:abstractNum w:abstractNumId="6" w15:restartNumberingAfterBreak="0">
+    <w:nsid w:val="15CD1E9F"/>
+    <w:multiLevelType w:val="hybridMultilevel"/>
+    <w:tmpl w:val="FDF43902"/>
+    <w:lvl w:ilvl="0" w:tplc="08090001">
+      <w:start w:val="1"/>
+      <w:numFmt w:val="bullet"/>
+      <w:lvlText w:val=""/>
+      <w:lvlJc w:val="left"/>
+      <w:pPr>
+        <w:ind w:left="720" w:hanging="360"/>
+      </w:pPr>
+      <w:rPr>
+        <w:rFonts w:ascii="Symbol" w:hAnsi="Symbol" w:hint="default"/>
+      </w:rPr>
+    </w:lvl>
+    <w:lvl w:ilvl="1" w:tplc="08090003" w:tentative="1">
+      <w:start w:val="1"/>
+      <w:numFmt w:val="bullet"/>
+      <w:lvlText w:val="o"/>
+      <w:lvlJc w:val="left"/>
+      <w:pPr>
+        <w:ind w:left="1440" w:hanging="360"/>
+      </w:pPr>
+      <w:rPr>
+        <w:rFonts w:ascii="Courier New" w:hAnsi="Courier New" w:cs="Courier New" w:hint="default"/>
+      </w:rPr>
+    </w:lvl>
+    <w:lvl w:ilvl="2" w:tplc="08090005" w:tentative="1">
+      <w:start w:val="1"/>
+      <w:numFmt w:val="bullet"/>
+      <w:lvlText w:val=""/>
+      <w:lvlJc w:val="left"/>
+      <w:pPr>
+        <w:ind w:left="2160" w:hanging="360"/>
+      </w:pPr>
+      <w:rPr>
+        <w:rFonts w:ascii="Wingdings" w:hAnsi="Wingdings" w:hint="default"/>
+      </w:rPr>
+    </w:lvl>
+    <w:lvl w:ilvl="3" w:tplc="08090001" w:tentative="1">
+      <w:start w:val="1"/>
+      <w:numFmt w:val="bullet"/>
+      <w:lvlText w:val=""/>
+      <w:lvlJc w:val="left"/>
+      <w:pPr>
+        <w:ind w:left="2880" w:hanging="360"/>
+      </w:pPr>
+      <w:rPr>
+        <w:rFonts w:ascii="Symbol" w:hAnsi="Symbol" w:hint="default"/>
+      </w:rPr>
+    </w:lvl>
+    <w:lvl w:ilvl="4" w:tplc="08090003" w:tentative="1">
+      <w:start w:val="1"/>
+      <w:numFmt w:val="bullet"/>
+      <w:lvlText w:val="o"/>
+      <w:lvlJc w:val="left"/>
+      <w:pPr>
+        <w:ind w:left="3600" w:hanging="360"/>
+      </w:pPr>
+      <w:rPr>
+        <w:rFonts w:ascii="Courier New" w:hAnsi="Courier New" w:cs="Courier New" w:hint="default"/>
+      </w:rPr>
+    </w:lvl>
+    <w:lvl w:ilvl="5" w:tplc="08090005" w:tentative="1">
+      <w:start w:val="1"/>
+      <w:numFmt w:val="bullet"/>
+      <w:lvlText w:val=""/>
+      <w:lvlJc w:val="left"/>
+      <w:pPr>
+        <w:ind w:left="4320" w:hanging="360"/>
+      </w:pPr>
+      <w:rPr>
+        <w:rFonts w:ascii="Wingdings" w:hAnsi="Wingdings" w:hint="default"/>
+      </w:rPr>
+    </w:lvl>
+    <w:lvl w:ilvl="6" w:tplc="08090001" w:tentative="1">
+      <w:start w:val="1"/>
+      <w:numFmt w:val="bullet"/>
+      <w:lvlText w:val=""/>
+      <w:lvlJc w:val="left"/>
+      <w:pPr>
+        <w:ind w:left="5040" w:hanging="360"/>
+      </w:pPr>
+      <w:rPr>
+        <w:rFonts w:ascii="Symbol" w:hAnsi="Symbol" w:hint="default"/>
+      </w:rPr>
+    </w:lvl>
+    <w:lvl w:ilvl="7" w:tplc="08090003" w:tentative="1">
+      <w:start w:val="1"/>
+      <w:numFmt w:val="bullet"/>
+      <w:lvlText w:val="o"/>
+      <w:lvlJc w:val="left"/>
+      <w:pPr>
+        <w:ind w:left="5760" w:hanging="360"/>
+      </w:pPr>
+      <w:rPr>
+        <w:rFonts w:ascii="Courier New" w:hAnsi="Courier New" w:cs="Courier New" w:hint="default"/>
+      </w:rPr>
+    </w:lvl>
+    <w:lvl w:ilvl="8" w:tplc="08090005" w:tentative="1">
+      <w:start w:val="1"/>
+      <w:numFmt w:val="bullet"/>
+      <w:lvlText w:val=""/>
+      <w:lvlJc w:val="left"/>
+      <w:pPr>
+        <w:ind w:left="6480" w:hanging="360"/>
+      </w:pPr>
+      <w:rPr>
+        <w:rFonts w:ascii="Wingdings" w:hAnsi="Wingdings" w:hint="default"/>
+      </w:rPr>
+    </w:lvl>
+  </w:abstractNum>
+  <w:abstractNum w:abstractNumId="7" w15:restartNumberingAfterBreak="0">
     <w:nsid w:val="53B6455F"/>
     <w:multiLevelType w:val="hybridMultilevel"/>
     <w:tmpl w:val="4ED6BC86"/>
@@ -868,7 +1429,7 @@
       </w:pPr>
     </w:lvl>
   </w:abstractNum>
-  <w:abstractNum w:abstractNumId="6" w15:restartNumberingAfterBreak="0">
+  <w:abstractNum w:abstractNumId="8" w15:restartNumberingAfterBreak="0">
     <w:nsid w:val="67D17D62"/>
     <w:multiLevelType w:val="hybridMultilevel"/>
     <w:tmpl w:val="E0105CF8"/>
@@ -954,7 +1515,7 @@
       </w:pPr>
     </w:lvl>
   </w:abstractNum>
-  <w:abstractNum w:abstractNumId="7" w15:restartNumberingAfterBreak="0">
+  <w:abstractNum w:abstractNumId="9" w15:restartNumberingAfterBreak="0">
     <w:nsid w:val="746A5C0A"/>
     <w:multiLevelType w:val="hybridMultilevel"/>
     <w:tmpl w:val="50DEA51A"/>
@@ -1067,7 +1628,96 @@
       </w:rPr>
     </w:lvl>
   </w:abstractNum>
-  <w:abstractNum w:abstractNumId="8" w15:restartNumberingAfterBreak="0">
+  <w:abstractNum w:abstractNumId="10" w15:restartNumberingAfterBreak="0">
+    <w:nsid w:val="791564A6"/>
+    <w:multiLevelType w:val="hybridMultilevel"/>
+    <w:tmpl w:val="0DD0342E"/>
+    <w:lvl w:ilvl="0" w:tplc="33EC4A26">
+      <w:start w:val="1"/>
+      <w:numFmt w:val="lowerRoman"/>
+      <w:lvlText w:val="%1."/>
+      <w:lvlJc w:val="left"/>
+      <w:pPr>
+        <w:ind w:left="1080" w:hanging="720"/>
+      </w:pPr>
+      <w:rPr>
+        <w:rFonts w:hint="default"/>
+      </w:rPr>
+    </w:lvl>
+    <w:lvl w:ilvl="1" w:tplc="08090019">
+      <w:start w:val="1"/>
+      <w:numFmt w:val="lowerLetter"/>
+      <w:lvlText w:val="%2."/>
+      <w:lvlJc w:val="left"/>
+      <w:pPr>
+        <w:ind w:left="1440" w:hanging="360"/>
+      </w:pPr>
+    </w:lvl>
+    <w:lvl w:ilvl="2" w:tplc="0809001B" w:tentative="1">
+      <w:start w:val="1"/>
+      <w:numFmt w:val="lowerRoman"/>
+      <w:lvlText w:val="%3."/>
+      <w:lvlJc w:val="right"/>
+      <w:pPr>
+        <w:ind w:left="2160" w:hanging="180"/>
+      </w:pPr>
+    </w:lvl>
+    <w:lvl w:ilvl="3" w:tplc="0809000F" w:tentative="1">
+      <w:start w:val="1"/>
+      <w:numFmt w:val="decimal"/>
+      <w:lvlText w:val="%4."/>
+      <w:lvlJc w:val="left"/>
+      <w:pPr>
+        <w:ind w:left="2880" w:hanging="360"/>
+      </w:pPr>
+    </w:lvl>
+    <w:lvl w:ilvl="4" w:tplc="08090019" w:tentative="1">
+      <w:start w:val="1"/>
+      <w:numFmt w:val="lowerLetter"/>
+      <w:lvlText w:val="%5."/>
+      <w:lvlJc w:val="left"/>
+      <w:pPr>
+        <w:ind w:left="3600" w:hanging="360"/>
+      </w:pPr>
+    </w:lvl>
+    <w:lvl w:ilvl="5" w:tplc="0809001B" w:tentative="1">
+      <w:start w:val="1"/>
+      <w:numFmt w:val="lowerRoman"/>
+      <w:lvlText w:val="%6."/>
+      <w:lvlJc w:val="right"/>
+      <w:pPr>
+        <w:ind w:left="4320" w:hanging="180"/>
+      </w:pPr>
+    </w:lvl>
+    <w:lvl w:ilvl="6" w:tplc="0809000F" w:tentative="1">
+      <w:start w:val="1"/>
+      <w:numFmt w:val="decimal"/>
+      <w:lvlText w:val="%7."/>
+      <w:lvlJc w:val="left"/>
+      <w:pPr>
+        <w:ind w:left="5040" w:hanging="360"/>
+      </w:pPr>
+    </w:lvl>
+    <w:lvl w:ilvl="7" w:tplc="08090019" w:tentative="1">
+      <w:start w:val="1"/>
+      <w:numFmt w:val="lowerLetter"/>
+      <w:lvlText w:val="%8."/>
+      <w:lvlJc w:val="left"/>
+      <w:pPr>
+        <w:ind w:left="5760" w:hanging="360"/>
+      </w:pPr>
+    </w:lvl>
+    <w:lvl w:ilvl="8" w:tplc="0809001B" w:tentative="1">
+      <w:start w:val="1"/>
+      <w:numFmt w:val="lowerRoman"/>
+      <w:lvlText w:val="%9."/>
+      <w:lvlJc w:val="right"/>
+      <w:pPr>
+        <w:ind w:left="6480" w:hanging="180"/>
+      </w:pPr>
+    </w:lvl>
+  </w:abstractNum>
+  <w:abstractNum w:abstractNumId="11" w15:restartNumberingAfterBreak="0">
     <w:nsid w:val="7AEC6FE5"/>
     <w:multiLevelType w:val="hybridMultilevel"/>
     <w:tmpl w:val="463A8764"/>
@@ -1156,7 +1806,7 @@
       </w:pPr>
     </w:lvl>
   </w:abstractNum>
-  <w:abstractNum w:abstractNumId="9" w15:restartNumberingAfterBreak="0">
+  <w:abstractNum w:abstractNumId="12" w15:restartNumberingAfterBreak="0">
     <w:nsid w:val="7D5203AC"/>
     <w:multiLevelType w:val="hybridMultilevel"/>
     <w:tmpl w:val="10DAC126"/>
@@ -1243,34 +1893,43 @@
     </w:lvl>
   </w:abstractNum>
   <w:num w:numId="1" w16cid:durableId="853226515">
-    <w:abstractNumId w:val="7"/>
+    <w:abstractNumId w:val="9"/>
   </w:num>
   <w:num w:numId="2" w16cid:durableId="1165441885">
-    <w:abstractNumId w:val="4"/>
+    <w:abstractNumId w:val="5"/>
   </w:num>
   <w:num w:numId="3" w16cid:durableId="34241236">
-    <w:abstractNumId w:val="6"/>
+    <w:abstractNumId w:val="8"/>
   </w:num>
   <w:num w:numId="4" w16cid:durableId="309870290">
-    <w:abstractNumId w:val="1"/>
+    <w:abstractNumId w:val="2"/>
   </w:num>
   <w:num w:numId="5" w16cid:durableId="778842978">
-    <w:abstractNumId w:val="9"/>
+    <w:abstractNumId w:val="12"/>
   </w:num>
   <w:num w:numId="6" w16cid:durableId="386995064">
-    <w:abstractNumId w:val="2"/>
+    <w:abstractNumId w:val="3"/>
   </w:num>
   <w:num w:numId="7" w16cid:durableId="2125885894">
     <w:abstractNumId w:val="0"/>
   </w:num>
   <w:num w:numId="8" w16cid:durableId="1378430212">
-    <w:abstractNumId w:val="8"/>
+    <w:abstractNumId w:val="11"/>
   </w:num>
   <w:num w:numId="9" w16cid:durableId="1532064723">
-    <w:abstractNumId w:val="5"/>
+    <w:abstractNumId w:val="7"/>
   </w:num>
   <w:num w:numId="10" w16cid:durableId="230386996">
-    <w:abstractNumId w:val="3"/>
+    <w:abstractNumId w:val="4"/>
+  </w:num>
+  <w:num w:numId="11" w16cid:durableId="1297418227">
+    <w:abstractNumId w:val="6"/>
+  </w:num>
+  <w:num w:numId="12" w16cid:durableId="977106624">
+    <w:abstractNumId w:val="1"/>
+  </w:num>
+  <w:num w:numId="13" w16cid:durableId="1859930123">
+    <w:abstractNumId w:val="10"/>
   </w:num>
 </w:numbering>
 </file>

</xml_diff>